<commit_message>
Ajout manque angles 6ème
</commit_message>
<xml_diff>
--- a/Cours/6eme/SaintExupery/Chapitre_7_2/Documents/Chapitre 7 - Partie 2 - Angles particuliers et bissectrice (A trou).docx
+++ b/Cours/6eme/SaintExupery/Chapitre_7_2/Documents/Chapitre 7 - Partie 2 - Angles particuliers et bissectrice (A trou).docx
@@ -29,7 +29,8 @@
     <w:tbl>
       <w:tblPr>
         <w:tblStyle w:val="Grilledutableau"/>
-        <w:tblW w:w="0" w:type="auto"/>
+        <w:tblW w:w="10609" w:type="dxa"/>
+        <w:tblInd w:w="-567" w:type="dxa"/>
         <w:tblBorders>
           <w:top w:val="single" w:sz="18" w:space="0" w:color="E36C0A" w:themeColor="accent6" w:themeShade="BF"/>
           <w:left w:val="single" w:sz="18" w:space="0" w:color="E36C0A" w:themeColor="accent6" w:themeShade="BF"/>
@@ -38,12 +39,14 @@
           <w:insideH w:val="single" w:sz="18" w:space="0" w:color="E36C0A" w:themeColor="accent6" w:themeShade="BF"/>
           <w:insideV w:val="single" w:sz="18" w:space="0" w:color="E36C0A" w:themeColor="accent6" w:themeShade="BF"/>
         </w:tblBorders>
+        <w:tblLayout w:type="fixed"/>
         <w:tblLook w:val="04A0" w:firstRow="1" w:lastRow="0" w:firstColumn="1" w:lastColumn="0" w:noHBand="0" w:noVBand="1"/>
       </w:tblPr>
       <w:tblGrid>
-        <w:gridCol w:w="3292"/>
-        <w:gridCol w:w="3292"/>
-        <w:gridCol w:w="3293"/>
+        <w:gridCol w:w="2652"/>
+        <w:gridCol w:w="2652"/>
+        <w:gridCol w:w="2652"/>
+        <w:gridCol w:w="2653"/>
       </w:tblGrid>
       <w:tr>
         <w:trPr>
@@ -51,7 +54,7 @@
         </w:trPr>
         <w:tc>
           <w:tcPr>
-            <w:tcW w:w="3292" w:type="dxa"/>
+            <w:tcW w:w="2652" w:type="dxa"/>
             <w:shd w:val="clear" w:color="auto" w:fill="FBD4B4" w:themeFill="accent6" w:themeFillTint="66"/>
             <w:vAlign w:val="center"/>
           </w:tcPr>
@@ -61,6 +64,8 @@
               <w:rPr>
                 <w:b/>
                 <w:bCs/>
+                <w:sz w:val="24"/>
+                <w:szCs w:val="24"/>
                 <w:u w:val="dash"/>
               </w:rPr>
             </w:pPr>
@@ -98,7 +103,7 @@
         </w:tc>
         <w:tc>
           <w:tcPr>
-            <w:tcW w:w="3292" w:type="dxa"/>
+            <w:tcW w:w="2652" w:type="dxa"/>
             <w:shd w:val="clear" w:color="auto" w:fill="FBD4B4" w:themeFill="accent6" w:themeFillTint="66"/>
             <w:vAlign w:val="center"/>
           </w:tcPr>
@@ -108,8 +113,7 @@
               <w:rPr>
                 <w:b/>
                 <w:bCs/>
-                <w:sz w:val="24"/>
-                <w:szCs w:val="24"/>
+                <w:u w:val="dash"/>
               </w:rPr>
             </w:pPr>
             <w:r>
@@ -146,7 +150,55 @@
         </w:tc>
         <w:tc>
           <w:tcPr>
-            <w:tcW w:w="3293" w:type="dxa"/>
+            <w:tcW w:w="2652" w:type="dxa"/>
+            <w:shd w:val="clear" w:color="auto" w:fill="FBD4B4" w:themeFill="accent6" w:themeFillTint="66"/>
+            <w:vAlign w:val="center"/>
+          </w:tcPr>
+          <w:p>
+            <w:pPr>
+              <w:jc w:val="center"/>
+              <w:rPr>
+                <w:b/>
+                <w:bCs/>
+                <w:sz w:val="24"/>
+                <w:szCs w:val="24"/>
+              </w:rPr>
+            </w:pPr>
+            <w:r>
+              <w:rPr>
+                <w:b/>
+                <w:bCs/>
+                <w:sz w:val="24"/>
+                <w:szCs w:val="24"/>
+                <w:u w:val="dash"/>
+              </w:rPr>
+              <w:tab/>
+            </w:r>
+            <w:r>
+              <w:rPr>
+                <w:b/>
+                <w:bCs/>
+                <w:sz w:val="24"/>
+                <w:szCs w:val="24"/>
+                <w:u w:val="dash"/>
+              </w:rPr>
+              <w:tab/>
+            </w:r>
+            <w:r>
+              <w:rPr>
+                <w:b/>
+                <w:bCs/>
+                <w:sz w:val="24"/>
+                <w:szCs w:val="24"/>
+                <w:u w:val="dash"/>
+              </w:rPr>
+              <w:tab/>
+            </w:r>
+          </w:p>
+        </w:tc>
+        <w:tc>
+          <w:tcPr>
+            <w:tcW w:w="2653" w:type="dxa"/>
             <w:shd w:val="clear" w:color="auto" w:fill="FBD4B4" w:themeFill="accent6" w:themeFillTint="66"/>
             <w:vAlign w:val="center"/>
           </w:tcPr>
@@ -196,22 +248,25 @@
       <w:tr>
         <w:tc>
           <w:tcPr>
-            <w:tcW w:w="3292" w:type="dxa"/>
+            <w:tcW w:w="2652" w:type="dxa"/>
             <w:vAlign w:val="center"/>
           </w:tcPr>
           <w:p>
             <w:pPr>
               <w:jc w:val="center"/>
+              <w:rPr>
+                <w:noProof/>
+              </w:rPr>
             </w:pPr>
             <w:r>
               <w:rPr>
                 <w:noProof/>
               </w:rPr>
               <w:drawing>
-                <wp:inline distT="0" distB="0" distL="0" distR="0" wp14:anchorId="57D3721A" wp14:editId="65CD29E2">
-                  <wp:extent cx="1624152" cy="612000"/>
-                  <wp:effectExtent l="0" t="0" r="0" b="0"/>
-                  <wp:docPr id="15" name="Graphique 15"/>
+                <wp:inline distT="0" distB="0" distL="0" distR="0" wp14:anchorId="495F375C" wp14:editId="64DB9F02">
+                  <wp:extent cx="1477440" cy="648000"/>
+                  <wp:effectExtent l="0" t="0" r="8890" b="0"/>
+                  <wp:docPr id="8" name="Graphique 8"/>
                   <wp:cNvGraphicFramePr>
                     <a:graphicFrameLocks xmlns:a="http://schemas.openxmlformats.org/drawingml/2006/main" noChangeAspect="1"/>
                   </wp:cNvGraphicFramePr>
@@ -237,7 +292,7 @@
                         <pic:spPr>
                           <a:xfrm>
                             <a:off x="0" y="0"/>
-                            <a:ext cx="1624152" cy="612000"/>
+                            <a:ext cx="1477440" cy="648000"/>
                           </a:xfrm>
                           <a:prstGeom prst="rect">
                             <a:avLst/>
@@ -253,7 +308,64 @@
         </w:tc>
         <w:tc>
           <w:tcPr>
-            <w:tcW w:w="3292" w:type="dxa"/>
+            <w:tcW w:w="2652" w:type="dxa"/>
+            <w:vAlign w:val="center"/>
+          </w:tcPr>
+          <w:p>
+            <w:pPr>
+              <w:jc w:val="center"/>
+            </w:pPr>
+            <w:r>
+              <w:rPr>
+                <w:noProof/>
+              </w:rPr>
+              <w:drawing>
+                <wp:inline distT="0" distB="0" distL="0" distR="0" wp14:anchorId="57D3721A" wp14:editId="3DEED158">
+                  <wp:extent cx="1526875" cy="575345"/>
+                  <wp:effectExtent l="0" t="0" r="0" b="0"/>
+                  <wp:docPr id="15" name="Graphique 15"/>
+                  <wp:cNvGraphicFramePr>
+                    <a:graphicFrameLocks xmlns:a="http://schemas.openxmlformats.org/drawingml/2006/main" noChangeAspect="1"/>
+                  </wp:cNvGraphicFramePr>
+                  <a:graphic xmlns:a="http://schemas.openxmlformats.org/drawingml/2006/main">
+                    <a:graphicData uri="http://schemas.openxmlformats.org/drawingml/2006/picture">
+                      <pic:pic xmlns:pic="http://schemas.openxmlformats.org/drawingml/2006/picture">
+                        <pic:nvPicPr>
+                          <pic:cNvPr id="1" name=""/>
+                          <pic:cNvPicPr/>
+                        </pic:nvPicPr>
+                        <pic:blipFill>
+                          <a:blip r:embed="rId10">
+                            <a:extLst>
+                              <a:ext uri="{96DAC541-7B7A-43D3-8B79-37D633B846F1}">
+                                <asvg:svgBlip xmlns:asvg="http://schemas.microsoft.com/office/drawing/2016/SVG/main" r:embed="rId11"/>
+                              </a:ext>
+                            </a:extLst>
+                          </a:blip>
+                          <a:stretch>
+                            <a:fillRect/>
+                          </a:stretch>
+                        </pic:blipFill>
+                        <pic:spPr>
+                          <a:xfrm>
+                            <a:off x="0" y="0"/>
+                            <a:ext cx="1533058" cy="577675"/>
+                          </a:xfrm>
+                          <a:prstGeom prst="rect">
+                            <a:avLst/>
+                          </a:prstGeom>
+                        </pic:spPr>
+                      </pic:pic>
+                    </a:graphicData>
+                  </a:graphic>
+                </wp:inline>
+              </w:drawing>
+            </w:r>
+          </w:p>
+        </w:tc>
+        <w:tc>
+          <w:tcPr>
+            <w:tcW w:w="2652" w:type="dxa"/>
             <w:vAlign w:val="center"/>
           </w:tcPr>
           <w:p>
@@ -287,10 +399,10 @@
                           <pic:cNvPicPr/>
                         </pic:nvPicPr>
                         <pic:blipFill>
-                          <a:blip r:embed="rId10">
+                          <a:blip r:embed="rId12">
                             <a:extLst>
                               <a:ext uri="{96DAC541-7B7A-43D3-8B79-37D633B846F1}">
-                                <asvg:svgBlip xmlns:asvg="http://schemas.microsoft.com/office/drawing/2016/SVG/main" r:embed="rId11"/>
+                                <asvg:svgBlip xmlns:asvg="http://schemas.microsoft.com/office/drawing/2016/SVG/main" r:embed="rId13"/>
                               </a:ext>
                             </a:extLst>
                           </a:blip>
@@ -317,7 +429,7 @@
         </w:tc>
         <w:tc>
           <w:tcPr>
-            <w:tcW w:w="3293" w:type="dxa"/>
+            <w:tcW w:w="2653" w:type="dxa"/>
           </w:tcPr>
           <w:p>
             <w:pPr>
@@ -350,10 +462,10 @@
                           <pic:cNvPicPr/>
                         </pic:nvPicPr>
                         <pic:blipFill>
-                          <a:blip r:embed="rId12">
+                          <a:blip r:embed="rId14">
                             <a:extLst>
                               <a:ext uri="{96DAC541-7B7A-43D3-8B79-37D633B846F1}">
-                                <asvg:svgBlip xmlns:asvg="http://schemas.microsoft.com/office/drawing/2016/SVG/main" r:embed="rId13"/>
+                                <asvg:svgBlip xmlns:asvg="http://schemas.microsoft.com/office/drawing/2016/SVG/main" r:embed="rId15"/>
                               </a:ext>
                             </a:extLst>
                           </a:blip>
@@ -385,14 +497,18 @@
         </w:trPr>
         <w:tc>
           <w:tcPr>
-            <w:tcW w:w="3292" w:type="dxa"/>
+            <w:tcW w:w="2652" w:type="dxa"/>
             <w:vAlign w:val="center"/>
           </w:tcPr>
           <w:p>
             <w:pPr>
               <w:jc w:val="center"/>
               <w:rPr>
-                <w:noProof/>
+                <w:b/>
+                <w:bCs/>
+                <w:sz w:val="24"/>
+                <w:szCs w:val="24"/>
+                <w:u w:val="dash"/>
               </w:rPr>
             </w:pPr>
             <w:r>
@@ -429,7 +545,7 @@
         </w:tc>
         <w:tc>
           <w:tcPr>
-            <w:tcW w:w="3292" w:type="dxa"/>
+            <w:tcW w:w="2652" w:type="dxa"/>
             <w:vAlign w:val="center"/>
           </w:tcPr>
           <w:p>
@@ -473,7 +589,51 @@
         </w:tc>
         <w:tc>
           <w:tcPr>
-            <w:tcW w:w="3293" w:type="dxa"/>
+            <w:tcW w:w="2652" w:type="dxa"/>
+            <w:vAlign w:val="center"/>
+          </w:tcPr>
+          <w:p>
+            <w:pPr>
+              <w:jc w:val="center"/>
+              <w:rPr>
+                <w:noProof/>
+              </w:rPr>
+            </w:pPr>
+            <w:r>
+              <w:rPr>
+                <w:b/>
+                <w:bCs/>
+                <w:sz w:val="24"/>
+                <w:szCs w:val="24"/>
+                <w:u w:val="dash"/>
+              </w:rPr>
+              <w:tab/>
+            </w:r>
+            <w:r>
+              <w:rPr>
+                <w:b/>
+                <w:bCs/>
+                <w:sz w:val="24"/>
+                <w:szCs w:val="24"/>
+                <w:u w:val="dash"/>
+              </w:rPr>
+              <w:tab/>
+            </w:r>
+            <w:r>
+              <w:rPr>
+                <w:b/>
+                <w:bCs/>
+                <w:sz w:val="24"/>
+                <w:szCs w:val="24"/>
+                <w:u w:val="dash"/>
+              </w:rPr>
+              <w:tab/>
+            </w:r>
+          </w:p>
+        </w:tc>
+        <w:tc>
+          <w:tcPr>
+            <w:tcW w:w="2653" w:type="dxa"/>
             <w:vAlign w:val="center"/>
           </w:tcPr>
           <w:p>
@@ -752,10 +912,10 @@
                           <pic:cNvPicPr/>
                         </pic:nvPicPr>
                         <pic:blipFill>
-                          <a:blip r:embed="rId14">
+                          <a:blip r:embed="rId16">
                             <a:extLst>
                               <a:ext uri="{96DAC541-7B7A-43D3-8B79-37D633B846F1}">
-                                <asvg:svgBlip xmlns:asvg="http://schemas.microsoft.com/office/drawing/2016/SVG/main" r:embed="rId15"/>
+                                <asvg:svgBlip xmlns:asvg="http://schemas.microsoft.com/office/drawing/2016/SVG/main" r:embed="rId17"/>
                               </a:ext>
                             </a:extLst>
                           </a:blip>
@@ -816,10 +976,10 @@
                           <pic:cNvPicPr/>
                         </pic:nvPicPr>
                         <pic:blipFill>
-                          <a:blip r:embed="rId16">
+                          <a:blip r:embed="rId18">
                             <a:extLst>
                               <a:ext uri="{96DAC541-7B7A-43D3-8B79-37D633B846F1}">
-                                <asvg:svgBlip xmlns:asvg="http://schemas.microsoft.com/office/drawing/2016/SVG/main" r:embed="rId17"/>
+                                <asvg:svgBlip xmlns:asvg="http://schemas.microsoft.com/office/drawing/2016/SVG/main" r:embed="rId19"/>
                               </a:ext>
                             </a:extLst>
                           </a:blip>
@@ -1174,7 +1334,7 @@
       <w:tr>
         <w:tc>
           <w:tcPr>
-            <w:tcW w:w="2410" w:type="dxa"/>
+            <w:tcW w:w="3006" w:type="dxa"/>
           </w:tcPr>
           <w:p>
             <w:pPr>
@@ -1204,13 +1364,13 @@
                           <pic:cNvPicPr/>
                         </pic:nvPicPr>
                         <pic:blipFill>
-                          <a:blip r:embed="rId18">
+                          <a:blip r:embed="rId20">
                             <a:extLst>
                               <a:ext uri="{28A0092B-C50C-407E-A947-70E740481C1C}">
                                 <a14:useLocalDpi xmlns:a14="http://schemas.microsoft.com/office/drawing/2010/main" val="0"/>
                               </a:ext>
                               <a:ext uri="{96DAC541-7B7A-43D3-8B79-37D633B846F1}">
-                                <asvg:svgBlip xmlns:asvg="http://schemas.microsoft.com/office/drawing/2016/SVG/main" r:embed="rId19"/>
+                                <asvg:svgBlip xmlns:asvg="http://schemas.microsoft.com/office/drawing/2016/SVG/main" r:embed="rId21"/>
                               </a:ext>
                             </a:extLst>
                           </a:blip>
@@ -1237,7 +1397,7 @@
         </w:tc>
         <w:tc>
           <w:tcPr>
-            <w:tcW w:w="7503" w:type="dxa"/>
+            <w:tcW w:w="6917" w:type="dxa"/>
             <w:vAlign w:val="center"/>
           </w:tcPr>
           <w:p>
@@ -1322,11 +1482,830 @@
       </w:tr>
     </w:tbl>
     <w:p>
+      <w:r>
+        <w:rPr>
+          <w:noProof/>
+          <w:lang w:eastAsia="fr-FR"/>
+        </w:rPr>
+        <w:lastRenderedPageBreak/>
+        <mc:AlternateContent>
+          <mc:Choice Requires="wps">
+            <w:drawing>
+              <wp:inline distT="0" distB="0" distL="0" distR="0" wp14:anchorId="78574BE4" wp14:editId="7E057B96">
+                <wp:extent cx="6200349" cy="1538737"/>
+                <wp:effectExtent l="57150" t="57150" r="10160" b="23495"/>
+                <wp:docPr id="3" name="Zone de texte 2"/>
+                <wp:cNvGraphicFramePr>
+                  <a:graphicFrameLocks xmlns:a="http://schemas.openxmlformats.org/drawingml/2006/main"/>
+                </wp:cNvGraphicFramePr>
+                <a:graphic xmlns:a="http://schemas.openxmlformats.org/drawingml/2006/main">
+                  <a:graphicData uri="http://schemas.microsoft.com/office/word/2010/wordprocessingShape">
+                    <wps:wsp>
+                      <wps:cNvSpPr txBox="1">
+                        <a:spLocks noChangeArrowheads="1"/>
+                      </wps:cNvSpPr>
+                      <wps:spPr bwMode="auto">
+                        <a:xfrm>
+                          <a:off x="0" y="0"/>
+                          <a:ext cx="6200349" cy="1538737"/>
+                        </a:xfrm>
+                        <a:prstGeom prst="rect">
+                          <a:avLst/>
+                        </a:prstGeom>
+                        <a:solidFill>
+                          <a:srgbClr val="FFFFFF"/>
+                        </a:solidFill>
+                        <a:ln w="12700" cmpd="dbl">
+                          <a:solidFill>
+                            <a:srgbClr val="000000"/>
+                          </a:solidFill>
+                          <a:miter lim="800000"/>
+                          <a:headEnd/>
+                          <a:tailEnd/>
+                        </a:ln>
+                        <a:effectLst>
+                          <a:outerShdw dist="63500" dir="13500000" algn="br" rotWithShape="0">
+                            <a:schemeClr val="bg1">
+                              <a:lumMod val="85000"/>
+                              <a:lumOff val="0"/>
+                            </a:schemeClr>
+                          </a:outerShdw>
+                        </a:effectLst>
+                      </wps:spPr>
+                      <wps:txbx>
+                        <w:txbxContent>
+                          <w:p>
+                            <w:pPr>
+                              <w:tabs>
+                                <w:tab w:val="left" w:pos="9456"/>
+                              </w:tabs>
+                              <w:spacing w:before="240" w:line="480" w:lineRule="auto"/>
+                              <w:rPr>
+                                <w:rFonts w:ascii="Cambria Math" w:hAnsi="Cambria Math"/>
+                                <w:sz w:val="24"/>
+                                <w:szCs w:val="24"/>
+                                <w:u w:val="dash"/>
+                              </w:rPr>
+                            </w:pPr>
+                            <w:r>
+                              <w:rPr>
+                                <w:rFonts w:ascii="Cambria Math" w:hAnsi="Cambria Math"/>
+                                <w:sz w:val="24"/>
+                                <w:szCs w:val="24"/>
+                                <w:u w:val="dash"/>
+                              </w:rPr>
+                              <w:tab/>
+                            </w:r>
+                            <w:r>
+                              <w:rPr>
+                                <w:rFonts w:ascii="Cambria Math" w:hAnsi="Cambria Math"/>
+                                <w:sz w:val="24"/>
+                                <w:szCs w:val="24"/>
+                                <w:u w:val="dash"/>
+                              </w:rPr>
+                              <w:tab/>
+                            </w:r>
+                            <w:r>
+                              <w:rPr>
+                                <w:rFonts w:ascii="Cambria Math" w:hAnsi="Cambria Math"/>
+                                <w:sz w:val="24"/>
+                                <w:szCs w:val="24"/>
+                                <w:u w:val="dash"/>
+                              </w:rPr>
+                              <w:tab/>
+                            </w:r>
+                            <w:r>
+                              <w:rPr>
+                                <w:rFonts w:ascii="Cambria Math" w:hAnsi="Cambria Math"/>
+                                <w:sz w:val="24"/>
+                                <w:szCs w:val="24"/>
+                                <w:u w:val="dash"/>
+                              </w:rPr>
+                              <w:tab/>
+                            </w:r>
+                            <w:r>
+                              <w:rPr>
+                                <w:rFonts w:ascii="Cambria Math" w:hAnsi="Cambria Math"/>
+                                <w:sz w:val="24"/>
+                                <w:szCs w:val="24"/>
+                                <w:u w:val="dash"/>
+                              </w:rPr>
+                              <w:tab/>
+                            </w:r>
+                          </w:p>
+                          <w:p>
+                            <w:pPr>
+                              <w:tabs>
+                                <w:tab w:val="left" w:pos="8760"/>
+                              </w:tabs>
+                              <w:rPr>
+                                <w:rFonts w:ascii="Cambria Math" w:hAnsi="Cambria Math"/>
+                                <w:sz w:val="24"/>
+                                <w:szCs w:val="24"/>
+                              </w:rPr>
+                            </w:pPr>
+                          </w:p>
+                        </w:txbxContent>
+                      </wps:txbx>
+                      <wps:bodyPr rot="0" vert="horz" wrap="square" lIns="91440" tIns="45720" rIns="91440" bIns="45720" anchor="t" anchorCtr="0" upright="1">
+                        <a:noAutofit/>
+                      </wps:bodyPr>
+                    </wps:wsp>
+                  </a:graphicData>
+                </a:graphic>
+              </wp:inline>
+            </w:drawing>
+          </mc:Choice>
+          <mc:Fallback>
+            <w:pict>
+              <v:shapetype w14:anchorId="78574BE4" id="_x0000_t202" coordsize="21600,21600" o:spt="202" path="m,l,21600r21600,l21600,xe">
+                <v:stroke joinstyle="miter"/>
+                <v:path gradientshapeok="t" o:connecttype="rect"/>
+              </v:shapetype>
+              <v:shape id="_x0000_s1027" type="#_x0000_t202" style="width:488.2pt;height:121.15pt;visibility:visible;mso-wrap-style:square;mso-left-percent:-10001;mso-top-percent:-10001;mso-position-horizontal:absolute;mso-position-horizontal-relative:char;mso-position-vertical:absolute;mso-position-vertical-relative:line;mso-left-percent:-10001;mso-top-percent:-10001;v-text-anchor:top" o:gfxdata="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" strokeweight="1pt">
+                <v:stroke linestyle="thinThin"/>
+                <v:shadow on="t" color="#d8d8d8 [2732]" origin=".5,.5" offset="-1.24725mm,-1.24725mm"/>
+                <v:textbox>
+                  <w:txbxContent>
+                    <w:p>
+                      <w:pPr>
+                        <w:tabs>
+                          <w:tab w:val="left" w:pos="9456"/>
+                        </w:tabs>
+                        <w:spacing w:before="240" w:line="480" w:lineRule="auto"/>
+                        <w:rPr>
+                          <w:rFonts w:ascii="Cambria Math" w:hAnsi="Cambria Math"/>
+                          <w:sz w:val="24"/>
+                          <w:szCs w:val="24"/>
+                          <w:u w:val="dash"/>
+                        </w:rPr>
+                      </w:pPr>
+                      <w:r>
+                        <w:rPr>
+                          <w:rFonts w:ascii="Cambria Math" w:hAnsi="Cambria Math"/>
+                          <w:sz w:val="24"/>
+                          <w:szCs w:val="24"/>
+                          <w:u w:val="dash"/>
+                        </w:rPr>
+                        <w:tab/>
+                      </w:r>
+                      <w:r>
+                        <w:rPr>
+                          <w:rFonts w:ascii="Cambria Math" w:hAnsi="Cambria Math"/>
+                          <w:sz w:val="24"/>
+                          <w:szCs w:val="24"/>
+                          <w:u w:val="dash"/>
+                        </w:rPr>
+                        <w:tab/>
+                      </w:r>
+                      <w:r>
+                        <w:rPr>
+                          <w:rFonts w:ascii="Cambria Math" w:hAnsi="Cambria Math"/>
+                          <w:sz w:val="24"/>
+                          <w:szCs w:val="24"/>
+                          <w:u w:val="dash"/>
+                        </w:rPr>
+                        <w:tab/>
+                      </w:r>
+                      <w:r>
+                        <w:rPr>
+                          <w:rFonts w:ascii="Cambria Math" w:hAnsi="Cambria Math"/>
+                          <w:sz w:val="24"/>
+                          <w:szCs w:val="24"/>
+                          <w:u w:val="dash"/>
+                        </w:rPr>
+                        <w:tab/>
+                      </w:r>
+                      <w:r>
+                        <w:rPr>
+                          <w:rFonts w:ascii="Cambria Math" w:hAnsi="Cambria Math"/>
+                          <w:sz w:val="24"/>
+                          <w:szCs w:val="24"/>
+                          <w:u w:val="dash"/>
+                        </w:rPr>
+                        <w:tab/>
+                      </w:r>
+                    </w:p>
+                    <w:p>
+                      <w:pPr>
+                        <w:tabs>
+                          <w:tab w:val="left" w:pos="8760"/>
+                        </w:tabs>
+                        <w:rPr>
+                          <w:rFonts w:ascii="Cambria Math" w:hAnsi="Cambria Math"/>
+                          <w:sz w:val="24"/>
+                          <w:szCs w:val="24"/>
+                        </w:rPr>
+                      </w:pPr>
+                    </w:p>
+                  </w:txbxContent>
+                </v:textbox>
+                <w10:anchorlock/>
+              </v:shape>
+            </w:pict>
+          </mc:Fallback>
+        </mc:AlternateContent>
+      </w:r>
+    </w:p>
+    <w:tbl>
+      <w:tblPr>
+        <w:tblStyle w:val="Grilledutableau"/>
+        <w:tblW w:w="0" w:type="auto"/>
+        <w:tblBorders>
+          <w:top w:val="none" w:sz="0" w:space="0" w:color="auto"/>
+          <w:left w:val="none" w:sz="0" w:space="0" w:color="auto"/>
+          <w:bottom w:val="none" w:sz="0" w:space="0" w:color="auto"/>
+          <w:right w:val="none" w:sz="0" w:space="0" w:color="auto"/>
+          <w:insideH w:val="none" w:sz="0" w:space="0" w:color="auto"/>
+          <w:insideV w:val="none" w:sz="0" w:space="0" w:color="auto"/>
+        </w:tblBorders>
+        <w:tblLook w:val="04A0" w:firstRow="1" w:lastRow="0" w:firstColumn="1" w:lastColumn="0" w:noHBand="0" w:noVBand="1"/>
+      </w:tblPr>
+      <w:tblGrid>
+        <w:gridCol w:w="2410"/>
+        <w:gridCol w:w="7503"/>
+      </w:tblGrid>
+      <w:tr>
+        <w:tc>
+          <w:tcPr>
+            <w:tcW w:w="2410" w:type="dxa"/>
+          </w:tcPr>
+          <w:p>
+            <w:pPr>
+              <w:rPr>
+                <w:lang w:eastAsia="fr-FR"/>
+              </w:rPr>
+            </w:pPr>
+            <w:r>
+              <w:rPr>
+                <w:rFonts w:eastAsia="Times New Roman" w:cs="Times New Roman"/>
+                <w:noProof/>
+                <w:lang w:eastAsia="fr-FR"/>
+              </w:rPr>
+              <w:drawing>
+                <wp:inline distT="0" distB="0" distL="0" distR="0" wp14:anchorId="5CDAE4EA" wp14:editId="548CCA9C">
+                  <wp:extent cx="864000" cy="1156433"/>
+                  <wp:effectExtent l="0" t="0" r="0" b="5715"/>
+                  <wp:docPr id="28" name="Graphique 28"/>
+                  <wp:cNvGraphicFramePr>
+                    <a:graphicFrameLocks xmlns:a="http://schemas.openxmlformats.org/drawingml/2006/main" noChangeAspect="1"/>
+                  </wp:cNvGraphicFramePr>
+                  <a:graphic xmlns:a="http://schemas.openxmlformats.org/drawingml/2006/main">
+                    <a:graphicData uri="http://schemas.openxmlformats.org/drawingml/2006/picture">
+                      <pic:pic xmlns:pic="http://schemas.openxmlformats.org/drawingml/2006/picture">
+                        <pic:nvPicPr>
+                          <pic:cNvPr id="1" name=""/>
+                          <pic:cNvPicPr/>
+                        </pic:nvPicPr>
+                        <pic:blipFill>
+                          <a:blip r:embed="rId22">
+                            <a:extLst>
+                              <a:ext uri="{96DAC541-7B7A-43D3-8B79-37D633B846F1}">
+                                <asvg:svgBlip xmlns:asvg="http://schemas.microsoft.com/office/drawing/2016/SVG/main" r:embed="rId23"/>
+                              </a:ext>
+                            </a:extLst>
+                          </a:blip>
+                          <a:stretch>
+                            <a:fillRect/>
+                          </a:stretch>
+                        </pic:blipFill>
+                        <pic:spPr>
+                          <a:xfrm>
+                            <a:off x="0" y="0"/>
+                            <a:ext cx="864000" cy="1156433"/>
+                          </a:xfrm>
+                          <a:prstGeom prst="rect">
+                            <a:avLst/>
+                          </a:prstGeom>
+                        </pic:spPr>
+                      </pic:pic>
+                    </a:graphicData>
+                  </a:graphic>
+                </wp:inline>
+              </w:drawing>
+            </w:r>
+          </w:p>
+        </w:tc>
+        <w:tc>
+          <w:tcPr>
+            <w:tcW w:w="7503" w:type="dxa"/>
+          </w:tcPr>
+          <w:p>
+            <w:pPr>
+              <w:pStyle w:val="Sous-titre"/>
+              <w:rPr>
+                <w:lang w:eastAsia="fr-FR"/>
+              </w:rPr>
+            </w:pPr>
+            <w:r>
+              <w:rPr>
+                <w:lang w:eastAsia="fr-FR"/>
+              </w:rPr>
+              <w:t>Exemple :</w:t>
+            </w:r>
+          </w:p>
+          <w:p>
+            <w:pPr>
+              <w:rPr>
+                <w:lang w:eastAsia="fr-FR"/>
+              </w:rPr>
+            </w:pPr>
+          </w:p>
+        </w:tc>
+      </w:tr>
+    </w:tbl>
+    <w:p>
+      <w:pPr>
+        <w:spacing w:before="100" w:beforeAutospacing="1" w:after="100" w:afterAutospacing="1" w:line="240" w:lineRule="auto"/>
+        <w:rPr>
+          <w:rFonts w:eastAsia="Times New Roman" w:cs="Times New Roman"/>
+          <w:lang w:eastAsia="fr-FR"/>
+        </w:rPr>
+      </w:pPr>
+      <w:r>
+        <w:rPr>
+          <w:noProof/>
+          <w:lang w:eastAsia="fr-FR"/>
+        </w:rPr>
+        <mc:AlternateContent>
+          <mc:Choice Requires="wps">
+            <w:drawing>
+              <wp:inline distT="0" distB="0" distL="0" distR="0" wp14:anchorId="37050836" wp14:editId="5718D3C3">
+                <wp:extent cx="6200349" cy="789011"/>
+                <wp:effectExtent l="57150" t="57150" r="10160" b="11430"/>
+                <wp:docPr id="5" name="Zone de texte 5"/>
+                <wp:cNvGraphicFramePr>
+                  <a:graphicFrameLocks xmlns:a="http://schemas.openxmlformats.org/drawingml/2006/main"/>
+                </wp:cNvGraphicFramePr>
+                <a:graphic xmlns:a="http://schemas.openxmlformats.org/drawingml/2006/main">
+                  <a:graphicData uri="http://schemas.microsoft.com/office/word/2010/wordprocessingShape">
+                    <wps:wsp>
+                      <wps:cNvSpPr txBox="1">
+                        <a:spLocks noChangeArrowheads="1"/>
+                      </wps:cNvSpPr>
+                      <wps:spPr bwMode="auto">
+                        <a:xfrm>
+                          <a:off x="0" y="0"/>
+                          <a:ext cx="6200349" cy="789011"/>
+                        </a:xfrm>
+                        <a:prstGeom prst="rect">
+                          <a:avLst/>
+                        </a:prstGeom>
+                        <a:solidFill>
+                          <a:srgbClr val="FFFFFF"/>
+                        </a:solidFill>
+                        <a:ln w="12700" cmpd="dbl">
+                          <a:solidFill>
+                            <a:srgbClr val="000000"/>
+                          </a:solidFill>
+                          <a:miter lim="800000"/>
+                          <a:headEnd/>
+                          <a:tailEnd/>
+                        </a:ln>
+                        <a:effectLst>
+                          <a:outerShdw dist="63500" dir="13500000" algn="br" rotWithShape="0">
+                            <a:schemeClr val="bg1">
+                              <a:lumMod val="85000"/>
+                              <a:lumOff val="0"/>
+                            </a:schemeClr>
+                          </a:outerShdw>
+                        </a:effectLst>
+                      </wps:spPr>
+                      <wps:txbx>
+                        <w:txbxContent>
+                          <w:p>
+                            <w:pPr>
+                              <w:tabs>
+                                <w:tab w:val="left" w:pos="9456"/>
+                              </w:tabs>
+                              <w:spacing w:before="240" w:line="480" w:lineRule="auto"/>
+                              <w:rPr>
+                                <w:rFonts w:ascii="Cambria Math" w:hAnsi="Cambria Math"/>
+                                <w:sz w:val="24"/>
+                                <w:szCs w:val="24"/>
+                                <w:u w:val="dash"/>
+                              </w:rPr>
+                            </w:pPr>
+                            <w:r>
+                              <w:rPr>
+                                <w:rFonts w:ascii="Cambria Math" w:hAnsi="Cambria Math"/>
+                                <w:sz w:val="24"/>
+                                <w:szCs w:val="24"/>
+                                <w:u w:val="dash"/>
+                              </w:rPr>
+                              <w:tab/>
+                            </w:r>
+                            <w:r>
+                              <w:rPr>
+                                <w:rFonts w:ascii="Cambria Math" w:hAnsi="Cambria Math"/>
+                                <w:sz w:val="24"/>
+                                <w:szCs w:val="24"/>
+                                <w:u w:val="dash"/>
+                              </w:rPr>
+                              <w:tab/>
+                            </w:r>
+                            <w:r>
+                              <w:rPr>
+                                <w:rFonts w:ascii="Cambria Math" w:hAnsi="Cambria Math"/>
+                                <w:sz w:val="24"/>
+                                <w:szCs w:val="24"/>
+                                <w:u w:val="dash"/>
+                              </w:rPr>
+                              <w:tab/>
+                            </w:r>
+                            <w:r>
+                              <w:rPr>
+                                <w:rFonts w:ascii="Cambria Math" w:hAnsi="Cambria Math"/>
+                                <w:sz w:val="24"/>
+                                <w:szCs w:val="24"/>
+                                <w:u w:val="dash"/>
+                              </w:rPr>
+                              <w:tab/>
+                            </w:r>
+                          </w:p>
+                          <w:p>
+                            <w:pPr>
+                              <w:tabs>
+                                <w:tab w:val="left" w:pos="8760"/>
+                              </w:tabs>
+                              <w:rPr>
+                                <w:rFonts w:ascii="Cambria Math" w:hAnsi="Cambria Math"/>
+                                <w:sz w:val="24"/>
+                                <w:szCs w:val="24"/>
+                              </w:rPr>
+                            </w:pPr>
+                          </w:p>
+                        </w:txbxContent>
+                      </wps:txbx>
+                      <wps:bodyPr rot="0" vert="horz" wrap="square" lIns="91440" tIns="45720" rIns="91440" bIns="45720" anchor="t" anchorCtr="0" upright="1">
+                        <a:noAutofit/>
+                      </wps:bodyPr>
+                    </wps:wsp>
+                  </a:graphicData>
+                </a:graphic>
+              </wp:inline>
+            </w:drawing>
+          </mc:Choice>
+          <mc:Fallback>
+            <w:pict>
+              <v:shape w14:anchorId="37050836" id="Zone de texte 5" o:spid="_x0000_s1028" type="#_x0000_t202" style="width:488.2pt;height:62.15pt;visibility:visible;mso-wrap-style:square;mso-left-percent:-10001;mso-top-percent:-10001;mso-position-horizontal:absolute;mso-position-horizontal-relative:char;mso-position-vertical:absolute;mso-position-vertical-relative:line;mso-left-percent:-10001;mso-top-percent:-10001;v-text-anchor:top" o:gfxdata="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" strokeweight="1pt">
+                <v:stroke linestyle="thinThin"/>
+                <v:shadow on="t" color="#d8d8d8 [2732]" origin=".5,.5" offset="-1.24725mm,-1.24725mm"/>
+                <v:textbox>
+                  <w:txbxContent>
+                    <w:p>
+                      <w:pPr>
+                        <w:tabs>
+                          <w:tab w:val="left" w:pos="9456"/>
+                        </w:tabs>
+                        <w:spacing w:before="240" w:line="480" w:lineRule="auto"/>
+                        <w:rPr>
+                          <w:rFonts w:ascii="Cambria Math" w:hAnsi="Cambria Math"/>
+                          <w:sz w:val="24"/>
+                          <w:szCs w:val="24"/>
+                          <w:u w:val="dash"/>
+                        </w:rPr>
+                      </w:pPr>
+                      <w:r>
+                        <w:rPr>
+                          <w:rFonts w:ascii="Cambria Math" w:hAnsi="Cambria Math"/>
+                          <w:sz w:val="24"/>
+                          <w:szCs w:val="24"/>
+                          <w:u w:val="dash"/>
+                        </w:rPr>
+                        <w:tab/>
+                      </w:r>
+                      <w:r>
+                        <w:rPr>
+                          <w:rFonts w:ascii="Cambria Math" w:hAnsi="Cambria Math"/>
+                          <w:sz w:val="24"/>
+                          <w:szCs w:val="24"/>
+                          <w:u w:val="dash"/>
+                        </w:rPr>
+                        <w:tab/>
+                      </w:r>
+                      <w:r>
+                        <w:rPr>
+                          <w:rFonts w:ascii="Cambria Math" w:hAnsi="Cambria Math"/>
+                          <w:sz w:val="24"/>
+                          <w:szCs w:val="24"/>
+                          <w:u w:val="dash"/>
+                        </w:rPr>
+                        <w:tab/>
+                      </w:r>
+                      <w:r>
+                        <w:rPr>
+                          <w:rFonts w:ascii="Cambria Math" w:hAnsi="Cambria Math"/>
+                          <w:sz w:val="24"/>
+                          <w:szCs w:val="24"/>
+                          <w:u w:val="dash"/>
+                        </w:rPr>
+                        <w:tab/>
+                      </w:r>
+                    </w:p>
+                    <w:p>
+                      <w:pPr>
+                        <w:tabs>
+                          <w:tab w:val="left" w:pos="8760"/>
+                        </w:tabs>
+                        <w:rPr>
+                          <w:rFonts w:ascii="Cambria Math" w:hAnsi="Cambria Math"/>
+                          <w:sz w:val="24"/>
+                          <w:szCs w:val="24"/>
+                        </w:rPr>
+                      </w:pPr>
+                    </w:p>
+                  </w:txbxContent>
+                </v:textbox>
+                <w10:anchorlock/>
+              </v:shape>
+            </w:pict>
+          </mc:Fallback>
+        </mc:AlternateContent>
+      </w:r>
+    </w:p>
+    <w:tbl>
+      <w:tblPr>
+        <w:tblStyle w:val="Grilledutableau"/>
+        <w:tblW w:w="0" w:type="auto"/>
+        <w:tblBorders>
+          <w:top w:val="none" w:sz="0" w:space="0" w:color="auto"/>
+          <w:left w:val="none" w:sz="0" w:space="0" w:color="auto"/>
+          <w:bottom w:val="none" w:sz="0" w:space="0" w:color="auto"/>
+          <w:right w:val="none" w:sz="0" w:space="0" w:color="auto"/>
+          <w:insideH w:val="none" w:sz="0" w:space="0" w:color="auto"/>
+          <w:insideV w:val="none" w:sz="0" w:space="0" w:color="auto"/>
+        </w:tblBorders>
+        <w:tblLook w:val="04A0" w:firstRow="1" w:lastRow="0" w:firstColumn="1" w:lastColumn="0" w:noHBand="0" w:noVBand="1"/>
+      </w:tblPr>
+      <w:tblGrid>
+        <w:gridCol w:w="3050"/>
+        <w:gridCol w:w="6873"/>
+      </w:tblGrid>
+      <w:tr>
+        <w:tc>
+          <w:tcPr>
+            <w:tcW w:w="3050" w:type="dxa"/>
+          </w:tcPr>
+          <w:p>
+            <w:pPr>
+              <w:rPr>
+                <w:lang w:eastAsia="fr-FR"/>
+              </w:rPr>
+            </w:pPr>
+            <w:r>
+              <w:rPr>
+                <w:rFonts w:eastAsia="Times New Roman" w:cs="Times New Roman"/>
+                <w:noProof/>
+                <w:lang w:eastAsia="fr-FR"/>
+              </w:rPr>
+              <w:drawing>
+                <wp:inline distT="0" distB="0" distL="0" distR="0" wp14:anchorId="6E80B901" wp14:editId="5B463B0C">
+                  <wp:extent cx="1800000" cy="1007692"/>
+                  <wp:effectExtent l="0" t="0" r="0" b="2540"/>
+                  <wp:docPr id="37" name="Graphique 37"/>
+                  <wp:cNvGraphicFramePr>
+                    <a:graphicFrameLocks xmlns:a="http://schemas.openxmlformats.org/drawingml/2006/main" noChangeAspect="1"/>
+                  </wp:cNvGraphicFramePr>
+                  <a:graphic xmlns:a="http://schemas.openxmlformats.org/drawingml/2006/main">
+                    <a:graphicData uri="http://schemas.openxmlformats.org/drawingml/2006/picture">
+                      <pic:pic xmlns:pic="http://schemas.openxmlformats.org/drawingml/2006/picture">
+                        <pic:nvPicPr>
+                          <pic:cNvPr id="37" name="Graphique 37"/>
+                          <pic:cNvPicPr/>
+                        </pic:nvPicPr>
+                        <pic:blipFill>
+                          <a:blip r:embed="rId24">
+                            <a:extLst>
+                              <a:ext uri="{28A0092B-C50C-407E-A947-70E740481C1C}">
+                                <a14:useLocalDpi xmlns:a14="http://schemas.microsoft.com/office/drawing/2010/main" val="0"/>
+                              </a:ext>
+                              <a:ext uri="{96DAC541-7B7A-43D3-8B79-37D633B846F1}">
+                                <asvg:svgBlip xmlns:asvg="http://schemas.microsoft.com/office/drawing/2016/SVG/main" r:embed="rId25"/>
+                              </a:ext>
+                            </a:extLst>
+                          </a:blip>
+                          <a:stretch>
+                            <a:fillRect/>
+                          </a:stretch>
+                        </pic:blipFill>
+                        <pic:spPr>
+                          <a:xfrm>
+                            <a:off x="0" y="0"/>
+                            <a:ext cx="1800000" cy="1007692"/>
+                          </a:xfrm>
+                          <a:prstGeom prst="rect">
+                            <a:avLst/>
+                          </a:prstGeom>
+                        </pic:spPr>
+                      </pic:pic>
+                    </a:graphicData>
+                  </a:graphic>
+                </wp:inline>
+              </w:drawing>
+            </w:r>
+          </w:p>
+        </w:tc>
+        <w:tc>
+          <w:tcPr>
+            <w:tcW w:w="6873" w:type="dxa"/>
+          </w:tcPr>
+          <w:p>
+            <w:pPr>
+              <w:pStyle w:val="Sous-titre"/>
+              <w:rPr>
+                <w:lang w:eastAsia="fr-FR"/>
+              </w:rPr>
+            </w:pPr>
+            <w:r>
+              <w:rPr>
+                <w:lang w:eastAsia="fr-FR"/>
+              </w:rPr>
+              <w:t>Exemple :</w:t>
+            </w:r>
+          </w:p>
+          <w:p>
+            <m:oMath>
+              <m:acc>
+                <m:accPr>
+                  <m:ctrlPr>
+                    <w:rPr>
+                      <w:rFonts w:ascii="Cambria Math" w:hAnsi="Cambria Math"/>
+                      <w:i/>
+                    </w:rPr>
+                  </m:ctrlPr>
+                </m:accPr>
+                <m:e>
+                  <m:r>
+                    <w:rPr>
+                      <w:rFonts w:ascii="Cambria Math" w:hAnsi="Cambria Math"/>
+                    </w:rPr>
+                    <m:t>AOB</m:t>
+                  </m:r>
+                </m:e>
+              </m:acc>
+            </m:oMath>
+            <w:r>
+              <w:rPr>
+                <w:rFonts w:eastAsiaTheme="minorEastAsia"/>
+              </w:rPr>
+              <w:t xml:space="preserve"> , </w:t>
+            </w:r>
+            <m:oMath>
+              <m:acc>
+                <m:accPr>
+                  <m:ctrlPr>
+                    <w:rPr>
+                      <w:rFonts w:ascii="Cambria Math" w:hAnsi="Cambria Math"/>
+                      <w:i/>
+                    </w:rPr>
+                  </m:ctrlPr>
+                </m:accPr>
+                <m:e>
+                  <m:r>
+                    <w:rPr>
+                      <w:rFonts w:ascii="Cambria Math" w:hAnsi="Cambria Math"/>
+                    </w:rPr>
+                    <m:t>BOC</m:t>
+                  </m:r>
+                </m:e>
+              </m:acc>
+            </m:oMath>
+            <w:r>
+              <w:rPr>
+                <w:rFonts w:eastAsiaTheme="minorEastAsia"/>
+              </w:rPr>
+              <w:t xml:space="preserve"> </w:t>
+            </w:r>
+            <w:r>
+              <w:t xml:space="preserve">et </w:t>
+            </w:r>
+            <m:oMath>
+              <m:acc>
+                <m:accPr>
+                  <m:ctrlPr>
+                    <w:rPr>
+                      <w:rFonts w:ascii="Cambria Math" w:hAnsi="Cambria Math"/>
+                      <w:i/>
+                    </w:rPr>
+                  </m:ctrlPr>
+                </m:accPr>
+                <m:e>
+                  <m:r>
+                    <w:rPr>
+                      <w:rFonts w:ascii="Cambria Math" w:hAnsi="Cambria Math"/>
+                    </w:rPr>
+                    <m:t>COD</m:t>
+                  </m:r>
+                </m:e>
+              </m:acc>
+            </m:oMath>
+            <w:r>
+              <w:t xml:space="preserve"> sont </w:t>
+            </w:r>
+            <w:r>
+              <w:rPr>
+                <w:b/>
+                <w:bCs/>
+              </w:rPr>
+              <w:t>supplémentaires</w:t>
+            </w:r>
+            <w:r>
+              <w:t xml:space="preserve"> car :</w:t>
+            </w:r>
+          </w:p>
+          <w:p>
+            <w:pPr>
+              <w:rPr>
+                <w:lang w:eastAsia="fr-FR"/>
+              </w:rPr>
+            </w:pPr>
+            <m:oMath>
+              <m:acc>
+                <m:accPr>
+                  <m:ctrlPr>
+                    <w:rPr>
+                      <w:rFonts w:ascii="Cambria Math" w:hAnsi="Cambria Math"/>
+                      <w:i/>
+                    </w:rPr>
+                  </m:ctrlPr>
+                </m:accPr>
+                <m:e>
+                  <m:r>
+                    <w:rPr>
+                      <w:rFonts w:ascii="Cambria Math" w:hAnsi="Cambria Math"/>
+                    </w:rPr>
+                    <m:t>AOB</m:t>
+                  </m:r>
+                </m:e>
+              </m:acc>
+              <m:r>
+                <w:rPr>
+                  <w:rFonts w:ascii="Cambria Math" w:hAnsi="Cambria Math"/>
+                </w:rPr>
+                <m:t xml:space="preserve">+ </m:t>
+              </m:r>
+              <m:acc>
+                <m:accPr>
+                  <m:ctrlPr>
+                    <w:rPr>
+                      <w:rFonts w:ascii="Cambria Math" w:hAnsi="Cambria Math"/>
+                      <w:i/>
+                    </w:rPr>
+                  </m:ctrlPr>
+                </m:accPr>
+                <m:e>
+                  <m:r>
+                    <w:rPr>
+                      <w:rFonts w:ascii="Cambria Math" w:hAnsi="Cambria Math"/>
+                    </w:rPr>
+                    <m:t>BOC</m:t>
+                  </m:r>
+                </m:e>
+              </m:acc>
+              <m:r>
+                <w:rPr>
+                  <w:rFonts w:ascii="Cambria Math" w:hAnsi="Cambria Math"/>
+                </w:rPr>
+                <m:t xml:space="preserve">+ </m:t>
+              </m:r>
+              <m:acc>
+                <m:accPr>
+                  <m:ctrlPr>
+                    <w:rPr>
+                      <w:rFonts w:ascii="Cambria Math" w:hAnsi="Cambria Math"/>
+                      <w:i/>
+                    </w:rPr>
+                  </m:ctrlPr>
+                </m:accPr>
+                <m:e>
+                  <m:r>
+                    <w:rPr>
+                      <w:rFonts w:ascii="Cambria Math" w:hAnsi="Cambria Math"/>
+                    </w:rPr>
+                    <m:t>COD</m:t>
+                  </m:r>
+                </m:e>
+              </m:acc>
+              <m:r>
+                <w:rPr>
+                  <w:rFonts w:ascii="Cambria Math" w:hAnsi="Cambria Math"/>
+                </w:rPr>
+                <m:t>=54+90 + 36=180°</m:t>
+              </m:r>
+            </m:oMath>
+            <w:r>
+              <w:t>.</w:t>
+            </w:r>
+          </w:p>
+        </w:tc>
+      </w:tr>
+    </w:tbl>
+    <w:p>
       <w:pPr>
         <w:pStyle w:val="Titre1"/>
       </w:pPr>
       <w:r>
-        <w:lastRenderedPageBreak/>
         <w:t>I</w:t>
       </w:r>
       <w:r>
@@ -1650,13 +2629,13 @@
                           <pic:cNvPicPr/>
                         </pic:nvPicPr>
                         <pic:blipFill>
-                          <a:blip r:embed="rId20">
+                          <a:blip r:embed="rId26">
                             <a:extLst>
                               <a:ext uri="{28A0092B-C50C-407E-A947-70E740481C1C}">
                                 <a14:useLocalDpi xmlns:a14="http://schemas.microsoft.com/office/drawing/2010/main" val="0"/>
                               </a:ext>
                               <a:ext uri="{96DAC541-7B7A-43D3-8B79-37D633B846F1}">
-                                <asvg:svgBlip xmlns:asvg="http://schemas.microsoft.com/office/drawing/2016/SVG/main" r:embed="rId21"/>
+                                <asvg:svgBlip xmlns:asvg="http://schemas.microsoft.com/office/drawing/2016/SVG/main" r:embed="rId27"/>
                               </a:ext>
                             </a:extLst>
                           </a:blip>
@@ -1919,10 +2898,10 @@
                           <pic:cNvPicPr/>
                         </pic:nvPicPr>
                         <pic:blipFill>
-                          <a:blip r:embed="rId22">
+                          <a:blip r:embed="rId28">
                             <a:extLst>
                               <a:ext uri="{96DAC541-7B7A-43D3-8B79-37D633B846F1}">
-                                <asvg:svgBlip xmlns:asvg="http://schemas.microsoft.com/office/drawing/2016/SVG/main" r:embed="rId23"/>
+                                <asvg:svgBlip xmlns:asvg="http://schemas.microsoft.com/office/drawing/2016/SVG/main" r:embed="rId29"/>
                               </a:ext>
                             </a:extLst>
                           </a:blip>
@@ -1979,10 +2958,10 @@
                           <pic:cNvPicPr/>
                         </pic:nvPicPr>
                         <pic:blipFill>
-                          <a:blip r:embed="rId22">
+                          <a:blip r:embed="rId28">
                             <a:extLst>
                               <a:ext uri="{96DAC541-7B7A-43D3-8B79-37D633B846F1}">
-                                <asvg:svgBlip xmlns:asvg="http://schemas.microsoft.com/office/drawing/2016/SVG/main" r:embed="rId23"/>
+                                <asvg:svgBlip xmlns:asvg="http://schemas.microsoft.com/office/drawing/2016/SVG/main" r:embed="rId29"/>
                               </a:ext>
                             </a:extLst>
                           </a:blip>
@@ -2039,10 +3018,10 @@
                           <pic:cNvPicPr/>
                         </pic:nvPicPr>
                         <pic:blipFill>
-                          <a:blip r:embed="rId22">
+                          <a:blip r:embed="rId28">
                             <a:extLst>
                               <a:ext uri="{96DAC541-7B7A-43D3-8B79-37D633B846F1}">
-                                <asvg:svgBlip xmlns:asvg="http://schemas.microsoft.com/office/drawing/2016/SVG/main" r:embed="rId23"/>
+                                <asvg:svgBlip xmlns:asvg="http://schemas.microsoft.com/office/drawing/2016/SVG/main" r:embed="rId29"/>
                               </a:ext>
                             </a:extLst>
                           </a:blip>
@@ -2099,10 +3078,10 @@
                           <pic:cNvPicPr/>
                         </pic:nvPicPr>
                         <pic:blipFill>
-                          <a:blip r:embed="rId22">
+                          <a:blip r:embed="rId28">
                             <a:extLst>
                               <a:ext uri="{96DAC541-7B7A-43D3-8B79-37D633B846F1}">
-                                <asvg:svgBlip xmlns:asvg="http://schemas.microsoft.com/office/drawing/2016/SVG/main" r:embed="rId23"/>
+                                <asvg:svgBlip xmlns:asvg="http://schemas.microsoft.com/office/drawing/2016/SVG/main" r:embed="rId29"/>
                               </a:ext>
                             </a:extLst>
                           </a:blip>
@@ -2159,10 +3138,10 @@
                           <pic:cNvPicPr/>
                         </pic:nvPicPr>
                         <pic:blipFill>
-                          <a:blip r:embed="rId22">
+                          <a:blip r:embed="rId28">
                             <a:extLst>
                               <a:ext uri="{96DAC541-7B7A-43D3-8B79-37D633B846F1}">
-                                <asvg:svgBlip xmlns:asvg="http://schemas.microsoft.com/office/drawing/2016/SVG/main" r:embed="rId23"/>
+                                <asvg:svgBlip xmlns:asvg="http://schemas.microsoft.com/office/drawing/2016/SVG/main" r:embed="rId29"/>
                               </a:ext>
                             </a:extLst>
                           </a:blip>
@@ -2219,10 +3198,10 @@
                           <pic:cNvPicPr/>
                         </pic:nvPicPr>
                         <pic:blipFill>
-                          <a:blip r:embed="rId22">
+                          <a:blip r:embed="rId28">
                             <a:extLst>
                               <a:ext uri="{96DAC541-7B7A-43D3-8B79-37D633B846F1}">
-                                <asvg:svgBlip xmlns:asvg="http://schemas.microsoft.com/office/drawing/2016/SVG/main" r:embed="rId23"/>
+                                <asvg:svgBlip xmlns:asvg="http://schemas.microsoft.com/office/drawing/2016/SVG/main" r:embed="rId29"/>
                               </a:ext>
                             </a:extLst>
                           </a:blip>
@@ -2251,26 +3230,20 @@
     </w:tbl>
     <w:p>
       <w:pPr>
-        <w:rPr>
-          <w:lang w:eastAsia="fr-FR"/>
-        </w:rPr>
-      </w:pPr>
-    </w:p>
-    <w:p>
-      <w:pPr>
         <w:pStyle w:val="Titre1"/>
         <w:rPr>
           <w:rStyle w:val="Accentuationlgre"/>
           <w:b w:val="0"/>
           <w:bCs w:val="0"/>
-          <w:sz w:val="24"/>
+          <w:sz w:val="16"/>
+          <w:szCs w:val="18"/>
         </w:rPr>
       </w:pPr>
     </w:p>
     <w:sectPr>
-      <w:footerReference w:type="default" r:id="rId24"/>
-      <w:headerReference w:type="first" r:id="rId25"/>
-      <w:footerReference w:type="first" r:id="rId26"/>
+      <w:footerReference w:type="default" r:id="rId30"/>
+      <w:headerReference w:type="first" r:id="rId31"/>
+      <w:footerReference w:type="first" r:id="rId32"/>
       <w:type w:val="continuous"/>
       <w:pgSz w:w="11906" w:h="16838"/>
       <w:pgMar w:top="420" w:right="849" w:bottom="426" w:left="1134" w:header="428" w:footer="123" w:gutter="0"/>

</xml_diff>